<commit_message>
PAUSED (task118): architecture 2 green at stage 5 and judged DETERMINISTIC on pass 7, the corrections ask's device moved from the autosaves (filed in 7.3) to schedules set back to draft; guard heart BLOCKs on ban.strategy and ban.pattern against task139 v2, the author's ban waiver owed
Co-Authored-By: Claude Opus 5.5 <noreply@anthropic.com>
Claude-Session: https://claude.ai/code/session_01Es2YJxT597uNAuNJZNdYR4
</commit_message>
<xml_diff>
--- a/task118/golden/squad_placement_2027.docx
+++ b/task118/golden/squad_placement_2027.docx
@@ -12,7 +12,7 @@
           <w:i w:val="0"/>
           <w:sz w:val="32"/>
         </w:rPr>
-        <w:t>Headline squad 2027: send the squad to Culture·national</w:t>
+        <w:t>Headline squad 2027: send the squad to Business·national</w:t>
       </w:r>
     </w:p>
     <w:p>
@@ -52,13 +52,13 @@
           <w:b/>
           <w:sz w:val="22"/>
         </w:rPr>
-        <w:t>Recommendation. The squad should join Culture·national in January. It would add 1,250,000 extra article clicks there in 2027.</w:t>
+        <w:t>Recommendation. The squad should join Business·national in January. It would add 500,000 article clicks to Bightline there in 2027.</w:t>
       </w:r>
       <w:r>
         <w:rPr>
           <w:sz w:val="22"/>
         </w:rPr>
-        <w:t xml:space="preserve"> The runner-up is Local·metro, at 800,000, which sits 450,000 behind.</w:t>
+        <w:t xml:space="preserve"> The runner-up is Local·metro, at 400,000, which sits 100,000 behind.</w:t>
       </w:r>
     </w:p>
     <w:p>
@@ -77,7 +77,7 @@
         <w:rPr>
           <w:sz w:val="21"/>
         </w:rPr>
-        <w:t>The brief judges the squad on incremental article clicks in the twelve months after it embeds, counted at the owning desk. Three things stand between a desk's 2027 clicks and what the squad would add to them.</w:t>
+        <w:t>The brief judges the squad the way Experimentation closes an embedding: on the clicks readers make in its year that they would not have made without it. Three steps take a desk's 2027 clicks to that figure.</w:t>
       </w:r>
     </w:p>
     <w:p>
@@ -88,7 +88,7 @@
         <w:rPr>
           <w:sz w:val="21"/>
         </w:rPr>
-        <w:t>First, the lift. A desk's average winning lift over-reads what a winning headline is worth, because the variant that wins a small test is usually the one that drew a lucky sample. Each shipped variant is shrunk toward one prior fitted on every package in the test archive, and the desk's lift is the mean over its tests. On that basis Culture·national lifts clicks by 1.78% on the headlines it tests. The same rule comes within 2% of the realised holdback lift for 7 of the squad's 7 finished embeddings; the raw lift does so for none.</w:t>
+        <w:t>First, the lift. A desk's average winning lift over-reads what a winning headline is worth, because the variant that wins a small test is usually the one that drew a lucky sample. Each shipped variant is shrunk toward one prior fitted on every package in the test archive, and the desk's lift is the mean over its tests: 2.00% for Business·national. The same rule comes within 2% of the realised holdback lift for 7 of the squad's 7 finished embeddings; the raw lift does so for none.</w:t>
       </w:r>
       <w:r>
         <w:rPr>
@@ -106,7 +106,18 @@
         <w:rPr>
           <w:sz w:val="21"/>
         </w:rPr>
-        <w:t>Second, where the click starts. A tested headline only shows on Bightline's own surfaces: the web and app home pages, section fronts and related links. Search, Discover, partner apps, social cards, newsletters and alerts carry the headline stored at publication, which a test does not change. 50.2% of Culture·national's 2027 clicks start on our own surfaces, against 94.7% for Local·metro.</w:t>
+        <w:t>Second, the clicks a shipped headline can reach. It replaces the old headline only on Bightline's own pages: the home pages, section fronts, app feed and tabs, and the related-story links. The squad also takes only the headlines a desk has not put under test itself. That leaves 34,900,000 of Business·national's 2027 clicks; at its lift, its winning headlines would win 700,000 clicks.</w:t>
+      </w:r>
+    </w:p>
+    <w:p>
+      <w:pPr>
+        <w:spacing w:after="120"/>
+      </w:pPr>
+      <w:r>
+        <w:rPr>
+          <w:sz w:val="21"/>
+        </w:rPr>
+        <w:t>Third, how many of those clicks are new to Bightline. A page shows a fixed set of headlines. When a better headline wins a click from a reader who would have clicked something else on the page, Bightline has moved a click, not gained one. Only views that would otherwise end with no article click can give a new one, and the page analytics show how many those are. About four in five views of the Culture front and the Culture tab already end in a click (83% and 81%), against fewer than one in eight on the related-story links (12%). 52% of Business·national's reachable clicks come through related-story links, so 71% of what its headlines win is new. Culture·national's come mostly through its own front and tab, so only 27% of its are. The change log bears this out: planned clicks times the realised lift times each desk's new share comes within 2% of the extra clicks measured against the holdback for 7 of 7 embeddings. One average share for every desk is within 2% for 2 and misses by up to 57%.</w:t>
       </w:r>
       <w:r>
         <w:rPr>
@@ -118,23 +129,12 @@
     </w:p>
     <w:p>
       <w:pPr>
-        <w:spacing w:after="120"/>
-      </w:pPr>
-      <w:r>
-        <w:rPr>
-          <w:sz w:val="21"/>
-        </w:rPr>
-        <w:t>Third, the tests each desk already runs. Every test in the archive at a shortlisted desk was set up by that desk's own staff, and their winners are already live inside the clicks the plan carries into 2027. The squad cannot add that gain a second time. Local·metro's editors already test the headlines behind 71.1% of its platform clicks, so most of its large reachable base is spoken for. Culture·national's editors ran 50 tests in the year, on articles carrying 8.6% of its platform clicks, which leaves the squad 70,300,000 clicks on untested headlines. At 1.78% that is 1,250,000.</w:t>
-      </w:r>
-    </w:p>
-    <w:p>
-      <w:pPr>
         <w:jc w:val="center"/>
       </w:pPr>
       <w:r>
         <w:drawing>
           <wp:inline xmlns:a="http://schemas.openxmlformats.org/drawingml/2006/main" xmlns:pic="http://schemas.openxmlformats.org/drawingml/2006/picture">
-            <wp:extent cx="5903999" cy="3607999"/>
+            <wp:extent cx="5903999" cy="3197999"/>
             <wp:docPr id="1" name="Picture 1"/>
             <wp:cNvGraphicFramePr>
               <a:graphicFrameLocks noChangeAspect="1"/>
@@ -155,7 +155,7 @@
                   <pic:spPr>
                     <a:xfrm>
                       <a:off x="0" y="0"/>
-                      <a:ext cx="5903999" cy="3607999"/>
+                      <a:ext cx="5903999" cy="3197999"/>
                     </a:xfrm>
                     <a:prstGeom prst="rect"/>
                   </pic:spPr>
@@ -177,7 +177,7 @@
           <w:color w:val="595959"/>
           <w:sz w:val="17"/>
         </w:rPr>
-        <w:t>Chart: each desk from its 2027 clicks to the extra clicks the squad would add. Desks ordered by extra clicks.</w:t>
+        <w:t>Chart: for each desk, the clicks its winning headlines would win and the share of them that is new to Bightline. Desks ordered by extra clicks.</w:t>
       </w:r>
     </w:p>
     <w:p>
@@ -198,13 +198,13 @@
           <w:b/>
           <w:sz w:val="21"/>
         </w:rPr>
-        <w:t xml:space="preserve">Local·metro (800,000): </w:t>
+        <w:t xml:space="preserve">Local·metro (400,000): </w:t>
       </w:r>
       <w:r>
         <w:rPr>
           <w:sz w:val="21"/>
         </w:rPr>
-        <w:t>the largest reachable base on the list (94.7% of its clicks start on our surfaces), but its own editors already test the headlines behind 71.1% of them.</w:t>
+        <w:t>the strongest lift on the list (2.57%), but its readers reach it through the Brisbane home page, where nearly half the views already end in a click, and its own front, where more than two thirds do, and its editors already test the headlines behind 71% of its own-page clicks.</w:t>
       </w:r>
     </w:p>
     <w:p>
@@ -217,13 +217,13 @@
           <w:b/>
           <w:sz w:val="21"/>
         </w:rPr>
-        <w:t xml:space="preserve">Business·national (700,000): </w:t>
+        <w:t xml:space="preserve">Culture·national (350,000): </w:t>
       </w:r>
       <w:r>
         <w:rPr>
           <w:sz w:val="21"/>
         </w:rPr>
-        <w:t>big, steady tests and the strongest shrunk lift on the national list (2.00%), but 72.1% of its clicks arrive on surfaces that show the stored headline.</w:t>
+        <w:t>its winning headlines would win the most clicks of any desk (1,250,000), because its editors test very few of them. But 73% of those would be taken from the stories beside them on the Culture front and tab, so it adds 350,000 clicks to Bightline.</w:t>
       </w:r>
     </w:p>
     <w:p>
@@ -236,13 +236,13 @@
           <w:b/>
           <w:sz w:val="21"/>
         </w:rPr>
-        <w:t xml:space="preserve">Sport·national (650,000): </w:t>
+        <w:t xml:space="preserve">Sport·national (300,000): </w:t>
       </w:r>
       <w:r>
         <w:rPr>
           <w:sz w:val="21"/>
         </w:rPr>
-        <w:t>a large audience, but a modest lift (1.32%) and half its platform clicks already on tested headlines.</w:t>
+        <w:t>a large audience, but a modest lift (1.32%) and half its own-page clicks already on headlines its editors test.</w:t>
       </w:r>
     </w:p>
     <w:p>
@@ -255,13 +255,13 @@
           <w:b/>
           <w:sz w:val="21"/>
         </w:rPr>
-        <w:t xml:space="preserve">Politics·national (550,000): </w:t>
+        <w:t xml:space="preserve">Politics·national (300,000): </w:t>
       </w:r>
       <w:r>
         <w:rPr>
           <w:sz w:val="21"/>
         </w:rPr>
-        <w:t>leads on the dashboard's Politics figure (4.69%), but that average is pulled up by Politics·metro's small Brisbane tests; Politics·national's own tests shrink to 1.28%.</w:t>
+        <w:t>leads on the dashboard's Politics figure (4.69%), but that average is pulled up by Politics·metro's small Brisbane tests; Politics·national's own tests shrink to 1.28%, and most of its clicks arrive through search, partner apps and social cards, which keep the stored headline.</w:t>
       </w:r>
     </w:p>
     <w:p>
@@ -274,7 +274,7 @@
           <w:b/>
           <w:sz w:val="21"/>
         </w:rPr>
-        <w:t xml:space="preserve">Sport·metro (100,000): </w:t>
+        <w:t xml:space="preserve">Sport·metro (50,000): </w:t>
       </w:r>
       <w:r>
         <w:rPr>
@@ -288,7 +288,7 @@
         <w:pStyle w:val="Heading2"/>
       </w:pPr>
       <w:r>
-        <w:t>Readers and corrections</w:t>
+        <w:t>Headline corrections</w:t>
       </w:r>
     </w:p>
     <w:p>
@@ -299,7 +299,7 @@
         <w:rPr>
           <w:sz w:val="21"/>
         </w:rPr>
-        <w:t>Kayla's case is that the squad belongs where the readers are. Politics·national has the most, 3,180,000 a month over 13,041,000 visits, but readers do not change which headlines the squad can still move. Culture·national reaches 1,412,000 readers a month, and when one of its headlines is wrong the first correction comes a median 119 minutes after the article goes live. The full set is below and in the workbook.</w:t>
+        <w:t>Politics·national has the most readers on the panel, but readers do not change how many new clicks a headline can bring. When one of Business·national's headlines is wrong, the first correction comes a median 89 minutes after the article goes live: 10 of its 37 corrected articles within the hour and 6 after more than three hours. The full set is below and in the workbook.</w:t>
       </w:r>
       <w:r>
         <w:rPr>
@@ -318,16 +318,16 @@
         <w:tblLook w:firstColumn="1" w:firstRow="1" w:lastColumn="0" w:lastRow="0" w:noHBand="0" w:noVBand="1" w:val="04A0"/>
       </w:tblPr>
       <w:tblGrid>
-        <w:gridCol w:w="2211"/>
+        <w:gridCol w:w="2381"/>
         <w:gridCol w:w="1474"/>
-        <w:gridCol w:w="1474"/>
-        <w:gridCol w:w="1474"/>
-        <w:gridCol w:w="1474"/>
+        <w:gridCol w:w="1814"/>
+        <w:gridCol w:w="1361"/>
+        <w:gridCol w:w="1701"/>
       </w:tblGrid>
       <w:tr>
         <w:tc>
           <w:tcPr>
-            <w:tcW w:type="dxa" w:w="2211"/>
+            <w:tcW w:type="dxa" w:w="2381"/>
             <w:shd w:val="clear" w:color="auto" w:fill="1F3A5F"/>
           </w:tcPr>
           <w:p>
@@ -336,7 +336,7 @@
               <w:rPr>
                 <w:b/>
                 <w:color w:val="FFFFFF"/>
-                <w:sz w:val="17"/>
+                <w:sz w:val="16"/>
               </w:rPr>
               <w:t>Desk</w:t>
             </w:r>
@@ -353,7 +353,7 @@
               <w:rPr>
                 <w:b/>
                 <w:color w:val="FFFFFF"/>
-                <w:sz w:val="17"/>
+                <w:sz w:val="16"/>
               </w:rPr>
               <w:t>Extra clicks 2027</w:t>
             </w:r>
@@ -361,7 +361,7 @@
         </w:tc>
         <w:tc>
           <w:tcPr>
-            <w:tcW w:type="dxa" w:w="1474"/>
+            <w:tcW w:type="dxa" w:w="1814"/>
             <w:shd w:val="clear" w:color="auto" w:fill="1F3A5F"/>
           </w:tcPr>
           <w:p>
@@ -370,15 +370,15 @@
               <w:rPr>
                 <w:b/>
                 <w:color w:val="FFFFFF"/>
-                <w:sz w:val="17"/>
+                <w:sz w:val="16"/>
               </w:rPr>
-              <w:t>Monthly readers</w:t>
+              <w:t>Median minutes to first headline correction</w:t>
             </w:r>
           </w:p>
         </w:tc>
         <w:tc>
           <w:tcPr>
-            <w:tcW w:type="dxa" w:w="1474"/>
+            <w:tcW w:type="dxa" w:w="1361"/>
             <w:shd w:val="clear" w:color="auto" w:fill="1F3A5F"/>
           </w:tcPr>
           <w:p>
@@ -387,15 +387,15 @@
               <w:rPr>
                 <w:b/>
                 <w:color w:val="FFFFFF"/>
-                <w:sz w:val="17"/>
+                <w:sz w:val="16"/>
               </w:rPr>
-              <w:t>Monthly visits</w:t>
+              <w:t>Within an hour</w:t>
             </w:r>
           </w:p>
         </w:tc>
         <w:tc>
           <w:tcPr>
-            <w:tcW w:type="dxa" w:w="1474"/>
+            <w:tcW w:type="dxa" w:w="1701"/>
             <w:shd w:val="clear" w:color="auto" w:fill="1F3A5F"/>
           </w:tcPr>
           <w:p>
@@ -404,9 +404,9 @@
               <w:rPr>
                 <w:b/>
                 <w:color w:val="FFFFFF"/>
-                <w:sz w:val="17"/>
+                <w:sz w:val="16"/>
               </w:rPr>
-              <w:t>Median minutes to first headline correction</w:t>
+              <w:t>After more than three hours</w:t>
             </w:r>
           </w:p>
         </w:tc>
@@ -414,7 +414,7 @@
       <w:tr>
         <w:tc>
           <w:tcPr>
-            <w:tcW w:type="dxa" w:w="2211"/>
+            <w:tcW w:type="dxa" w:w="2381"/>
             <w:shd w:val="clear" w:color="auto" w:fill="FDF0E8"/>
           </w:tcPr>
           <w:p>
@@ -424,7 +424,7 @@
                 <w:b/>
                 <w:sz w:val="18"/>
               </w:rPr>
-              <w:t>Culture·national</w:t>
+              <w:t>Business·national</w:t>
             </w:r>
           </w:p>
         </w:tc>
@@ -443,13 +443,13 @@
                 <w:b w:val="0"/>
                 <w:sz w:val="18"/>
               </w:rPr>
-              <w:t>1,250,000</w:t>
+              <w:t>500,000</w:t>
             </w:r>
           </w:p>
         </w:tc>
         <w:tc>
           <w:tcPr>
-            <w:tcW w:type="dxa" w:w="1474"/>
+            <w:tcW w:type="dxa" w:w="1814"/>
             <w:shd w:val="clear" w:color="auto" w:fill="FDF0E8"/>
           </w:tcPr>
           <w:p>
@@ -462,13 +462,13 @@
                 <w:b w:val="0"/>
                 <w:sz w:val="18"/>
               </w:rPr>
-              <w:t>1,412,000</w:t>
+              <w:t>89</w:t>
             </w:r>
           </w:p>
         </w:tc>
         <w:tc>
           <w:tcPr>
-            <w:tcW w:type="dxa" w:w="1474"/>
+            <w:tcW w:type="dxa" w:w="1361"/>
             <w:shd w:val="clear" w:color="auto" w:fill="FDF0E8"/>
           </w:tcPr>
           <w:p>
@@ -481,13 +481,13 @@
                 <w:b w:val="0"/>
                 <w:sz w:val="18"/>
               </w:rPr>
-              <w:t>5,052,000</w:t>
+              <w:t>10</w:t>
             </w:r>
           </w:p>
         </w:tc>
         <w:tc>
           <w:tcPr>
-            <w:tcW w:type="dxa" w:w="1474"/>
+            <w:tcW w:type="dxa" w:w="1701"/>
             <w:shd w:val="clear" w:color="auto" w:fill="FDF0E8"/>
           </w:tcPr>
           <w:p>
@@ -500,7 +500,7 @@
                 <w:b w:val="0"/>
                 <w:sz w:val="18"/>
               </w:rPr>
-              <w:t>119</w:t>
+              <w:t>6</w:t>
             </w:r>
           </w:p>
         </w:tc>
@@ -508,7 +508,7 @@
       <w:tr>
         <w:tc>
           <w:tcPr>
-            <w:tcW w:type="dxa" w:w="2211"/>
+            <w:tcW w:type="dxa" w:w="2381"/>
           </w:tcPr>
           <w:p>
             <w:r/>
@@ -535,7 +535,78 @@
                 <w:b w:val="0"/>
                 <w:sz w:val="18"/>
               </w:rPr>
-              <w:t>800,000</w:t>
+              <w:t>400,000</w:t>
+            </w:r>
+          </w:p>
+        </w:tc>
+        <w:tc>
+          <w:tcPr>
+            <w:tcW w:type="dxa" w:w="1814"/>
+          </w:tcPr>
+          <w:p>
+            <w:pPr>
+              <w:jc w:val="right"/>
+            </w:pPr>
+            <w:r/>
+            <w:r>
+              <w:rPr>
+                <w:b w:val="0"/>
+                <w:sz w:val="18"/>
+              </w:rPr>
+              <w:t>102</w:t>
+            </w:r>
+          </w:p>
+        </w:tc>
+        <w:tc>
+          <w:tcPr>
+            <w:tcW w:type="dxa" w:w="1361"/>
+          </w:tcPr>
+          <w:p>
+            <w:pPr>
+              <w:jc w:val="right"/>
+            </w:pPr>
+            <w:r/>
+            <w:r>
+              <w:rPr>
+                <w:b w:val="0"/>
+                <w:sz w:val="18"/>
+              </w:rPr>
+              <w:t>12</w:t>
+            </w:r>
+          </w:p>
+        </w:tc>
+        <w:tc>
+          <w:tcPr>
+            <w:tcW w:type="dxa" w:w="1701"/>
+          </w:tcPr>
+          <w:p>
+            <w:pPr>
+              <w:jc w:val="right"/>
+            </w:pPr>
+            <w:r/>
+            <w:r>
+              <w:rPr>
+                <w:b w:val="0"/>
+                <w:sz w:val="18"/>
+              </w:rPr>
+              <w:t>6</w:t>
+            </w:r>
+          </w:p>
+        </w:tc>
+      </w:tr>
+      <w:tr>
+        <w:tc>
+          <w:tcPr>
+            <w:tcW w:type="dxa" w:w="2381"/>
+          </w:tcPr>
+          <w:p>
+            <w:r/>
+            <w:r>
+              <w:rPr>
+                <w:b w:val="0"/>
+                <w:sz w:val="18"/>
+              </w:rPr>
+              <w:t>Culture·national</w:t>
             </w:r>
           </w:p>
         </w:tc>
@@ -553,13 +624,13 @@
                 <w:b w:val="0"/>
                 <w:sz w:val="18"/>
               </w:rPr>
-              <w:t>617,000</w:t>
+              <w:t>350,000</w:t>
             </w:r>
           </w:p>
         </w:tc>
         <w:tc>
           <w:tcPr>
-            <w:tcW w:type="dxa" w:w="1474"/>
+            <w:tcW w:type="dxa" w:w="1814"/>
           </w:tcPr>
           <w:p>
             <w:pPr>
@@ -571,13 +642,13 @@
                 <w:b w:val="0"/>
                 <w:sz w:val="18"/>
               </w:rPr>
-              <w:t>2,359,000</w:t>
+              <w:t>119</w:t>
             </w:r>
           </w:p>
         </w:tc>
         <w:tc>
           <w:tcPr>
-            <w:tcW w:type="dxa" w:w="1474"/>
+            <w:tcW w:type="dxa" w:w="1361"/>
           </w:tcPr>
           <w:p>
             <w:pPr>
@@ -589,30 +660,13 @@
                 <w:b w:val="0"/>
                 <w:sz w:val="18"/>
               </w:rPr>
-              <w:t>102</w:t>
-            </w:r>
-          </w:p>
-        </w:tc>
-      </w:tr>
-      <w:tr>
-        <w:tc>
-          <w:tcPr>
-            <w:tcW w:type="dxa" w:w="2211"/>
-          </w:tcPr>
-          <w:p>
-            <w:r/>
-            <w:r>
-              <w:rPr>
-                <w:b w:val="0"/>
-                <w:sz w:val="18"/>
-              </w:rPr>
-              <w:t>Business·national</w:t>
+              <w:t>1</w:t>
             </w:r>
           </w:p>
         </w:tc>
         <w:tc>
           <w:tcPr>
-            <w:tcW w:type="dxa" w:w="1474"/>
+            <w:tcW w:type="dxa" w:w="1701"/>
           </w:tcPr>
           <w:p>
             <w:pPr>
@@ -624,61 +678,7 @@
                 <w:b w:val="0"/>
                 <w:sz w:val="18"/>
               </w:rPr>
-              <w:t>700,000</w:t>
-            </w:r>
-          </w:p>
-        </w:tc>
-        <w:tc>
-          <w:tcPr>
-            <w:tcW w:type="dxa" w:w="1474"/>
-          </w:tcPr>
-          <w:p>
-            <w:pPr>
-              <w:jc w:val="right"/>
-            </w:pPr>
-            <w:r/>
-            <w:r>
-              <w:rPr>
-                <w:b w:val="0"/>
-                <w:sz w:val="18"/>
-              </w:rPr>
-              <w:t>1,760,000</w:t>
-            </w:r>
-          </w:p>
-        </w:tc>
-        <w:tc>
-          <w:tcPr>
-            <w:tcW w:type="dxa" w:w="1474"/>
-          </w:tcPr>
-          <w:p>
-            <w:pPr>
-              <w:jc w:val="right"/>
-            </w:pPr>
-            <w:r/>
-            <w:r>
-              <w:rPr>
-                <w:b w:val="0"/>
-                <w:sz w:val="18"/>
-              </w:rPr>
-              <w:t>6,642,000</w:t>
-            </w:r>
-          </w:p>
-        </w:tc>
-        <w:tc>
-          <w:tcPr>
-            <w:tcW w:type="dxa" w:w="1474"/>
-          </w:tcPr>
-          <w:p>
-            <w:pPr>
-              <w:jc w:val="right"/>
-            </w:pPr>
-            <w:r/>
-            <w:r>
-              <w:rPr>
-                <w:b w:val="0"/>
-                <w:sz w:val="18"/>
-              </w:rPr>
-              <w:t>89</w:t>
+              <w:t>5</w:t>
             </w:r>
           </w:p>
         </w:tc>
@@ -686,7 +686,7 @@
       <w:tr>
         <w:tc>
           <w:tcPr>
-            <w:tcW w:type="dxa" w:w="2211"/>
+            <w:tcW w:type="dxa" w:w="2381"/>
           </w:tcPr>
           <w:p>
             <w:r/>
@@ -713,49 +713,13 @@
                 <w:b w:val="0"/>
                 <w:sz w:val="18"/>
               </w:rPr>
-              <w:t>650,000</w:t>
+              <w:t>300,000</w:t>
             </w:r>
           </w:p>
         </w:tc>
         <w:tc>
           <w:tcPr>
-            <w:tcW w:type="dxa" w:w="1474"/>
-          </w:tcPr>
-          <w:p>
-            <w:pPr>
-              <w:jc w:val="right"/>
-            </w:pPr>
-            <w:r/>
-            <w:r>
-              <w:rPr>
-                <w:b w:val="0"/>
-                <w:sz w:val="18"/>
-              </w:rPr>
-              <w:t>2,931,000</w:t>
-            </w:r>
-          </w:p>
-        </w:tc>
-        <w:tc>
-          <w:tcPr>
-            <w:tcW w:type="dxa" w:w="1474"/>
-          </w:tcPr>
-          <w:p>
-            <w:pPr>
-              <w:jc w:val="right"/>
-            </w:pPr>
-            <w:r/>
-            <w:r>
-              <w:rPr>
-                <w:b w:val="0"/>
-                <w:sz w:val="18"/>
-              </w:rPr>
-              <w:t>11,626,000</w:t>
-            </w:r>
-          </w:p>
-        </w:tc>
-        <w:tc>
-          <w:tcPr>
-            <w:tcW w:type="dxa" w:w="1474"/>
+            <w:tcW w:type="dxa" w:w="1814"/>
           </w:tcPr>
           <w:p>
             <w:pPr>
@@ -771,11 +735,47 @@
             </w:r>
           </w:p>
         </w:tc>
+        <w:tc>
+          <w:tcPr>
+            <w:tcW w:type="dxa" w:w="1361"/>
+          </w:tcPr>
+          <w:p>
+            <w:pPr>
+              <w:jc w:val="right"/>
+            </w:pPr>
+            <w:r/>
+            <w:r>
+              <w:rPr>
+                <w:b w:val="0"/>
+                <w:sz w:val="18"/>
+              </w:rPr>
+              <w:t>23</w:t>
+            </w:r>
+          </w:p>
+        </w:tc>
+        <w:tc>
+          <w:tcPr>
+            <w:tcW w:type="dxa" w:w="1701"/>
+          </w:tcPr>
+          <w:p>
+            <w:pPr>
+              <w:jc w:val="right"/>
+            </w:pPr>
+            <w:r/>
+            <w:r>
+              <w:rPr>
+                <w:b w:val="0"/>
+                <w:sz w:val="18"/>
+              </w:rPr>
+              <w:t>2</w:t>
+            </w:r>
+          </w:p>
+        </w:tc>
       </w:tr>
       <w:tr>
         <w:tc>
           <w:tcPr>
-            <w:tcW w:type="dxa" w:w="2211"/>
+            <w:tcW w:type="dxa" w:w="2381"/>
           </w:tcPr>
           <w:p>
             <w:r/>
@@ -802,49 +802,13 @@
                 <w:b w:val="0"/>
                 <w:sz w:val="18"/>
               </w:rPr>
-              <w:t>550,000</w:t>
+              <w:t>300,000</w:t>
             </w:r>
           </w:p>
         </w:tc>
         <w:tc>
           <w:tcPr>
-            <w:tcW w:type="dxa" w:w="1474"/>
-          </w:tcPr>
-          <w:p>
-            <w:pPr>
-              <w:jc w:val="right"/>
-            </w:pPr>
-            <w:r/>
-            <w:r>
-              <w:rPr>
-                <w:b w:val="0"/>
-                <w:sz w:val="18"/>
-              </w:rPr>
-              <w:t>3,180,000</w:t>
-            </w:r>
-          </w:p>
-        </w:tc>
-        <w:tc>
-          <w:tcPr>
-            <w:tcW w:type="dxa" w:w="1474"/>
-          </w:tcPr>
-          <w:p>
-            <w:pPr>
-              <w:jc w:val="right"/>
-            </w:pPr>
-            <w:r/>
-            <w:r>
-              <w:rPr>
-                <w:b w:val="0"/>
-                <w:sz w:val="18"/>
-              </w:rPr>
-              <w:t>13,041,000</w:t>
-            </w:r>
-          </w:p>
-        </w:tc>
-        <w:tc>
-          <w:tcPr>
-            <w:tcW w:type="dxa" w:w="1474"/>
+            <w:tcW w:type="dxa" w:w="1814"/>
           </w:tcPr>
           <w:p>
             <w:pPr>
@@ -860,11 +824,47 @@
             </w:r>
           </w:p>
         </w:tc>
+        <w:tc>
+          <w:tcPr>
+            <w:tcW w:type="dxa" w:w="1361"/>
+          </w:tcPr>
+          <w:p>
+            <w:pPr>
+              <w:jc w:val="right"/>
+            </w:pPr>
+            <w:r/>
+            <w:r>
+              <w:rPr>
+                <w:b w:val="0"/>
+                <w:sz w:val="18"/>
+              </w:rPr>
+              <w:t>14</w:t>
+            </w:r>
+          </w:p>
+        </w:tc>
+        <w:tc>
+          <w:tcPr>
+            <w:tcW w:type="dxa" w:w="1701"/>
+          </w:tcPr>
+          <w:p>
+            <w:pPr>
+              <w:jc w:val="right"/>
+            </w:pPr>
+            <w:r/>
+            <w:r>
+              <w:rPr>
+                <w:b w:val="0"/>
+                <w:sz w:val="18"/>
+              </w:rPr>
+              <w:t>7</w:t>
+            </w:r>
+          </w:p>
+        </w:tc>
       </w:tr>
       <w:tr>
         <w:tc>
           <w:tcPr>
-            <w:tcW w:type="dxa" w:w="2211"/>
+            <w:tcW w:type="dxa" w:w="2381"/>
           </w:tcPr>
           <w:p>
             <w:r/>
@@ -891,49 +891,13 @@
                 <w:b w:val="0"/>
                 <w:sz w:val="18"/>
               </w:rPr>
-              <w:t>100,000</w:t>
+              <w:t>50,000</w:t>
             </w:r>
           </w:p>
         </w:tc>
         <w:tc>
           <w:tcPr>
-            <w:tcW w:type="dxa" w:w="1474"/>
-          </w:tcPr>
-          <w:p>
-            <w:pPr>
-              <w:jc w:val="right"/>
-            </w:pPr>
-            <w:r/>
-            <w:r>
-              <w:rPr>
-                <w:b w:val="0"/>
-                <w:sz w:val="18"/>
-              </w:rPr>
-              <w:t>470,000</w:t>
-            </w:r>
-          </w:p>
-        </w:tc>
-        <w:tc>
-          <w:tcPr>
-            <w:tcW w:type="dxa" w:w="1474"/>
-          </w:tcPr>
-          <w:p>
-            <w:pPr>
-              <w:jc w:val="right"/>
-            </w:pPr>
-            <w:r/>
-            <w:r>
-              <w:rPr>
-                <w:b w:val="0"/>
-                <w:sz w:val="18"/>
-              </w:rPr>
-              <w:t>1,550,000</w:t>
-            </w:r>
-          </w:p>
-        </w:tc>
-        <w:tc>
-          <w:tcPr>
-            <w:tcW w:type="dxa" w:w="1474"/>
+            <w:tcW w:type="dxa" w:w="1814"/>
           </w:tcPr>
           <w:p>
             <w:pPr>
@@ -946,6 +910,42 @@
                 <w:sz w:val="18"/>
               </w:rPr>
               <w:t>55</w:t>
+            </w:r>
+          </w:p>
+        </w:tc>
+        <w:tc>
+          <w:tcPr>
+            <w:tcW w:type="dxa" w:w="1361"/>
+          </w:tcPr>
+          <w:p>
+            <w:pPr>
+              <w:jc w:val="right"/>
+            </w:pPr>
+            <w:r/>
+            <w:r>
+              <w:rPr>
+                <w:b w:val="0"/>
+                <w:sz w:val="18"/>
+              </w:rPr>
+              <w:t>9</w:t>
+            </w:r>
+          </w:p>
+        </w:tc>
+        <w:tc>
+          <w:tcPr>
+            <w:tcW w:type="dxa" w:w="1701"/>
+          </w:tcPr>
+          <w:p>
+            <w:pPr>
+              <w:jc w:val="right"/>
+            </w:pPr>
+            <w:r/>
+            <w:r>
+              <w:rPr>
+                <w:b w:val="0"/>
+                <w:sz w:val="18"/>
+              </w:rPr>
+              <w:t>2</w:t>
             </w:r>
           </w:p>
         </w:tc>
@@ -962,7 +962,7 @@
           <w:color w:val="595959"/>
           <w:sz w:val="16"/>
         </w:rPr>
-        <w:t>Source: 2027 audience plan; pageviews by source; headline test archive; panel monthly audience (restated releases); CMS revisions for the web desks. Readers, visits and minutes cover October 2025 to September 2026.</w:t>
+        <w:t>Source: 2027 audience plan; pageviews by source; page performance; headline test archive; CMS revisions for the web desks. Corrections cover October 2025 to September 2026.</w:t>
       </w:r>
     </w:p>
     <w:p>
@@ -984,7 +984,7 @@
           <w:color w:val="404040"/>
           <w:sz w:val="17"/>
         </w:rPr>
-        <w:t>1  Prior fitted by maximum likelihood on all 10,111 variant packages; a control that is kept counts as zero lift. Embedding-by-embedding results are on the workbook's Back-test sheet.</w:t>
+        <w:t>1  Prior fitted by maximum likelihood on all 10,111 variant packages; a control that is kept counts as zero lift. The workbook's Back-test sheet has both tests embedding by embedding.</w:t>
       </w:r>
     </w:p>
     <w:p>
@@ -998,7 +998,7 @@
           <w:color w:val="404040"/>
           <w:sz w:val="17"/>
         </w:rPr>
-        <w:t>2  Source codes as defined in the audience warehouse field reference. The 2027 plan holds every desk at its October 2025 to September 2026 clicks, with no change in where they come from.</w:t>
+        <w:t>2  Click-through is each page's article click-throughs over its views across the twelve months. A desk's clicks from the home page are on its edition's home page; from the front and the tab, on its own; the Pages sheet lists all 22 pages. The 2027 plan holds every desk at its October 2025 to September 2026 clicks.</w:t>
       </w:r>
     </w:p>
     <w:p>
@@ -1012,7 +1012,7 @@
           <w:color w:val="404040"/>
           <w:sz w:val="17"/>
         </w:rPr>
-        <w:t>3  Readers and visits are the panel's for the desk's section: releases up to R26-03 on the earlier section list and R26-04, the first on the 2026 content taxonomy, and every later release (the R26-04H history release included) on the 2026 list, each section's month taken from its latest release. The R26-07B restatement replaces April to June on both sites; the July file repeats those months as first published, and those rows are the replaced figures carried again. A headline correction is a new note on a published version that went up with a corrected headline, on the same save or on a save within ten minutes either side as the CMS export's field notes allow, a live-blog entry's headline included (editorial standards 7.4 and 7.5); a note carried forward, or put back after a save that left it off, is not a new correction. Articles are stories and live blogs first published October 2025 to September 2026; live-blog posts, restored copies and documents carried across at the 1 October 2025 migration are not separate articles. An article goes live at its first published version, the time the editor set (Brisbane time) if the CMS published it; a restored copy keeps its original's.</w:t>
+        <w:t>3  A headline correction is a new note on a published version that went up with a corrected headline, the fix and the note on one save or on saves up to ten minutes apart, a live-blog entry's headline included (editorial standards 7.3 to 7.5); a note carried forward, or put back after a save that left it off, is not a new correction. Articles are stories and live blogs first published October 2025 to September 2026; live-blog entries and restored copies are not separate articles. An article goes live when it is first published, at its scheduled time (Brisbane) if the CMS published it then; a restored copy keeps its original's.</w:t>
       </w:r>
     </w:p>
     <w:sectPr>

</xml_diff>